<commit_message>
Dokumenty: společná trojice smlouva + výměr (č.j./A) + dohoda (č.j./B) a pole Číslo jednací
Co-Authored-By: Claude Sonnet 5.5 <noreply@anthropic.com>
Claude-Session: https://claude.ai/code/session_011BGaNCiuY1gYKPgR4GUo9S
</commit_message>
<xml_diff>
--- a/templates/01_platovy_vymer.docx
+++ b/templates/01_platovy_vymer.docx
@@ -38,6 +38,33 @@
           <w:szCs w:val="36"/>
         </w:rPr>
         <w:t>PLATOVÝ VÝMĚR</w:t>
+      </w:r>
+    </w:p>
+    <w:p>
+      <w:pPr>
+        <w:widowControl w:val="0"/>
+        <w:autoSpaceDE w:val="0"/>
+        <w:autoSpaceDN w:val="0"/>
+        <w:adjustRightInd w:val="0"/>
+        <w:spacing w:before="29" w:after="0" w:line="369" w:lineRule="exact"/>
+        <w:ind w:left="15"/>
+        <w:jc w:val="center"/>
+        <w:rPr>
+          <w:rFonts w:ascii="Times New Roman" w:hAnsi="Times New Roman"/>
+          <w:b/>
+          <w:bCs/>
+          <w:sz w:val="36"/>
+          <w:szCs w:val="36"/>
+        </w:rPr>
+      </w:pPr>
+      <w:r>
+        <w:rPr>
+          <w:rFonts w:ascii="Times New Roman" w:hAnsi="Times New Roman"/>
+          <w:spacing w:val="100"/>
+          <w:sz w:val="20"/>
+          <w:szCs w:val="20"/>
+        </w:rPr>
+        <w:t xml:space="preserve">Č. j.: {{cj_a}}</w:t>
       </w:r>
     </w:p>
     <w:p>

</xml_diff>

<commit_message>
Dokumenty: pořadí číslování souborů, č.j. výměru v záhlaví, č.j. dohody černě
Co-Authored-By: Claude Sonnet 5.5 <noreply@anthropic.com>
Claude-Session: https://claude.ai/code/session_011BGaNCiuY1gYKPgR4GUo9S
</commit_message>
<xml_diff>
--- a/templates/01_platovy_vymer.docx
+++ b/templates/01_platovy_vymer.docx
@@ -38,33 +38,6 @@
           <w:szCs w:val="36"/>
         </w:rPr>
         <w:t>PLATOVÝ VÝMĚR</w:t>
-      </w:r>
-    </w:p>
-    <w:p>
-      <w:pPr>
-        <w:widowControl w:val="0"/>
-        <w:autoSpaceDE w:val="0"/>
-        <w:autoSpaceDN w:val="0"/>
-        <w:adjustRightInd w:val="0"/>
-        <w:spacing w:before="29" w:after="0" w:line="369" w:lineRule="exact"/>
-        <w:ind w:left="15"/>
-        <w:jc w:val="center"/>
-        <w:rPr>
-          <w:rFonts w:ascii="Times New Roman" w:hAnsi="Times New Roman"/>
-          <w:b/>
-          <w:bCs/>
-          <w:sz w:val="36"/>
-          <w:szCs w:val="36"/>
-        </w:rPr>
-      </w:pPr>
-      <w:r>
-        <w:rPr>
-          <w:rFonts w:ascii="Times New Roman" w:hAnsi="Times New Roman"/>
-          <w:spacing w:val="100"/>
-          <w:sz w:val="20"/>
-          <w:szCs w:val="20"/>
-        </w:rPr>
-        <w:t xml:space="preserve">Č. j.: {{cj_a}}</w:t>
       </w:r>
     </w:p>
     <w:p>
@@ -2155,7 +2128,7 @@
     </w:pPr>
     <w:r>
       <w:tab/>
-      <w:t xml:space="preserve">                                                             Č.j.: </w:t>
+      <w:t xml:space="preserve">                                                             Č.j.: {{cj_a}}</w:t>
     </w:r>
   </w:p>
 </w:hdr>

</xml_diff>